<commit_message>
refactor: rename project to AI Financial Intelligence Platform
</commit_message>
<xml_diff>
--- a/docs/PRD.docx
+++ b/docs/PRD.docx
@@ -143,18 +143,9 @@
           <w:szCs w:val="24"/>
           <w:lang w:eastAsia="en-GB"/>
         </w:rPr>
-        <w:t xml:space="preserve">The </w:t>
+        <w:t>The AI Financial</w:t>
       </w:r>
       <w:bookmarkStart w:id="0" w:name="_GoBack"/>
-      <w:r>
-        <w:rPr>
-          <w:rFonts w:ascii="Times New Roman" w:eastAsia="Times New Roman" w:hAnsi="Times New Roman" w:cs="Times New Roman"/>
-          <w:sz w:val="24"/>
-          <w:szCs w:val="24"/>
-          <w:lang w:eastAsia="en-GB"/>
-        </w:rPr>
-        <w:t xml:space="preserve">Gold AI Market Intelligence Platform </w:t>
-      </w:r>
       <w:bookmarkEnd w:id="0"/>
       <w:r>
         <w:rPr>
@@ -163,7 +154,7 @@
           <w:szCs w:val="24"/>
           <w:lang w:eastAsia="en-GB"/>
         </w:rPr>
-        <w:t>is an AI-powered financial analysis dashboard designed to assist gold traders by combining:</w:t>
+        <w:t xml:space="preserve"> Intelligence Platform is an AI-powered financial analysis dashboard designed to assist gold traders by combining:</w:t>
       </w:r>
     </w:p>
     <w:p>

</xml_diff>